<commit_message>
Dia 1: 6 reglas habilitadas, evidencia de flota, anexo actualizado y guia de operacion
- 6 reglas creadas en la app (temperatura, humedad de rack, humo, PM2.5, humedad de piso, eventos de acceso) con correo al operador
- herramienta estado_flota_api.py (REST de datos de IoT Central)
- pw.py y shot.py con --tab para fijar pestana (evita destruir los proyectos Wokwi)
- docs/05-operacion.md: rutina diaria, reconstruccion de ESP32 virtuales, pausa documentada y costo
- informe 11 paginas (seccion 9 con las reglas reales) y anexo de evidencias 9 paginas
- README: tabla de reglas y enlace a la guia de operacion
</commit_message>
<xml_diff>
--- a/informe/Informe_Parcial1_DC-ANDES-1.docx
+++ b/informe/Informe_Parcial1_DC-ANDES-1.docx
@@ -546,7 +546,14 @@
           <w:tab w:val="right" w:leader="dot" w:pos="9628"/>
         </w:tabs>
         <w:rPr>
+          <w:rFonts w:asciiTheme="minorHAnsi" w:eastAsiaTheme="minorEastAsia" w:hAnsiTheme="minorHAnsi"/>
           <w:noProof/>
+          <w:color w:val="auto"/>
+          <w:kern w:val="2"/>
+          <w:sz w:val="24"/>
+          <w:szCs w:val="24"/>
+          <w:lang w:val="es-CO" w:eastAsia="es-CO"/>
+          <w14:ligatures w14:val="standardContextual"/>
         </w:rPr>
       </w:pPr>
       <w:r>
@@ -558,7 +565,7 @@
       <w:r>
         <w:fldChar w:fldCharType="separate"/>
       </w:r>
-      <w:hyperlink w:anchor="_Toc241156662" w:history="1">
+      <w:hyperlink w:anchor="_Toc241161849" w:history="1">
         <w:r>
           <w:rPr>
             <w:rStyle w:val="Hipervnculo"/>
@@ -585,7 +592,7 @@
             <w:noProof/>
             <w:webHidden/>
           </w:rPr>
-          <w:instrText xml:space="preserve"> PAGEREF _Toc241156662 \h </w:instrText>
+          <w:instrText xml:space="preserve"> PAGEREF _Toc241161849 \h </w:instrText>
         </w:r>
         <w:r>
           <w:rPr>
@@ -623,10 +630,17 @@
           <w:tab w:val="right" w:leader="dot" w:pos="9628"/>
         </w:tabs>
         <w:rPr>
+          <w:rFonts w:asciiTheme="minorHAnsi" w:eastAsiaTheme="minorEastAsia" w:hAnsiTheme="minorHAnsi"/>
           <w:noProof/>
+          <w:color w:val="auto"/>
+          <w:kern w:val="2"/>
+          <w:sz w:val="24"/>
+          <w:szCs w:val="24"/>
+          <w:lang w:val="es-CO" w:eastAsia="es-CO"/>
+          <w14:ligatures w14:val="standardContextual"/>
         </w:rPr>
       </w:pPr>
-      <w:hyperlink w:anchor="_Toc241156663" w:history="1">
+      <w:hyperlink w:anchor="_Toc241161850" w:history="1">
         <w:r>
           <w:rPr>
             <w:rStyle w:val="Hipervnculo"/>
@@ -653,7 +667,7 @@
             <w:noProof/>
             <w:webHidden/>
           </w:rPr>
-          <w:instrText xml:space="preserve"> PAGEREF _Toc241156663 \h </w:instrText>
+          <w:instrText xml:space="preserve"> PAGEREF _Toc241161850 \h </w:instrText>
         </w:r>
         <w:r>
           <w:rPr>
@@ -691,10 +705,17 @@
           <w:tab w:val="right" w:leader="dot" w:pos="9628"/>
         </w:tabs>
         <w:rPr>
+          <w:rFonts w:asciiTheme="minorHAnsi" w:eastAsiaTheme="minorEastAsia" w:hAnsiTheme="minorHAnsi"/>
           <w:noProof/>
+          <w:color w:val="auto"/>
+          <w:kern w:val="2"/>
+          <w:sz w:val="24"/>
+          <w:szCs w:val="24"/>
+          <w:lang w:val="es-CO" w:eastAsia="es-CO"/>
+          <w14:ligatures w14:val="standardContextual"/>
         </w:rPr>
       </w:pPr>
-      <w:hyperlink w:anchor="_Toc241156664" w:history="1">
+      <w:hyperlink w:anchor="_Toc241161851" w:history="1">
         <w:r>
           <w:rPr>
             <w:rStyle w:val="Hipervnculo"/>
@@ -721,7 +742,7 @@
             <w:noProof/>
             <w:webHidden/>
           </w:rPr>
-          <w:instrText xml:space="preserve"> PAGEREF _Toc241156664 \h </w:instrText>
+          <w:instrText xml:space="preserve"> PAGEREF _Toc241161851 \h </w:instrText>
         </w:r>
         <w:r>
           <w:rPr>
@@ -759,10 +780,17 @@
           <w:tab w:val="right" w:leader="dot" w:pos="9628"/>
         </w:tabs>
         <w:rPr>
+          <w:rFonts w:asciiTheme="minorHAnsi" w:eastAsiaTheme="minorEastAsia" w:hAnsiTheme="minorHAnsi"/>
           <w:noProof/>
+          <w:color w:val="auto"/>
+          <w:kern w:val="2"/>
+          <w:sz w:val="24"/>
+          <w:szCs w:val="24"/>
+          <w:lang w:val="es-CO" w:eastAsia="es-CO"/>
+          <w14:ligatures w14:val="standardContextual"/>
         </w:rPr>
       </w:pPr>
-      <w:hyperlink w:anchor="_Toc241156665" w:history="1">
+      <w:hyperlink w:anchor="_Toc241161852" w:history="1">
         <w:r>
           <w:rPr>
             <w:rStyle w:val="Hipervnculo"/>
@@ -789,7 +817,7 @@
             <w:noProof/>
             <w:webHidden/>
           </w:rPr>
-          <w:instrText xml:space="preserve"> PAGEREF _Toc241156665 \h </w:instrText>
+          <w:instrText xml:space="preserve"> PAGEREF _Toc241161852 \h </w:instrText>
         </w:r>
         <w:r>
           <w:rPr>
@@ -827,10 +855,17 @@
           <w:tab w:val="right" w:leader="dot" w:pos="9628"/>
         </w:tabs>
         <w:rPr>
+          <w:rFonts w:asciiTheme="minorHAnsi" w:eastAsiaTheme="minorEastAsia" w:hAnsiTheme="minorHAnsi"/>
           <w:noProof/>
+          <w:color w:val="auto"/>
+          <w:kern w:val="2"/>
+          <w:sz w:val="24"/>
+          <w:szCs w:val="24"/>
+          <w:lang w:val="es-CO" w:eastAsia="es-CO"/>
+          <w14:ligatures w14:val="standardContextual"/>
         </w:rPr>
       </w:pPr>
-      <w:hyperlink w:anchor="_Toc241156666" w:history="1">
+      <w:hyperlink w:anchor="_Toc241161853" w:history="1">
         <w:r>
           <w:rPr>
             <w:rStyle w:val="Hipervnculo"/>
@@ -857,7 +892,7 @@
             <w:noProof/>
             <w:webHidden/>
           </w:rPr>
-          <w:instrText xml:space="preserve"> PAGEREF _Toc241156666 \h </w:instrText>
+          <w:instrText xml:space="preserve"> PAGEREF _Toc241161853 \h </w:instrText>
         </w:r>
         <w:r>
           <w:rPr>
@@ -895,10 +930,17 @@
           <w:tab w:val="right" w:leader="dot" w:pos="9628"/>
         </w:tabs>
         <w:rPr>
+          <w:rFonts w:asciiTheme="minorHAnsi" w:eastAsiaTheme="minorEastAsia" w:hAnsiTheme="minorHAnsi"/>
           <w:noProof/>
+          <w:color w:val="auto"/>
+          <w:kern w:val="2"/>
+          <w:sz w:val="24"/>
+          <w:szCs w:val="24"/>
+          <w:lang w:val="es-CO" w:eastAsia="es-CO"/>
+          <w14:ligatures w14:val="standardContextual"/>
         </w:rPr>
       </w:pPr>
-      <w:hyperlink w:anchor="_Toc241156667" w:history="1">
+      <w:hyperlink w:anchor="_Toc241161854" w:history="1">
         <w:r>
           <w:rPr>
             <w:rStyle w:val="Hipervnculo"/>
@@ -925,7 +967,7 @@
             <w:noProof/>
             <w:webHidden/>
           </w:rPr>
-          <w:instrText xml:space="preserve"> PAGEREF _Toc241156667 \h </w:instrText>
+          <w:instrText xml:space="preserve"> PAGEREF _Toc241161854 \h </w:instrText>
         </w:r>
         <w:r>
           <w:rPr>
@@ -963,10 +1005,17 @@
           <w:tab w:val="right" w:leader="dot" w:pos="9628"/>
         </w:tabs>
         <w:rPr>
+          <w:rFonts w:asciiTheme="minorHAnsi" w:eastAsiaTheme="minorEastAsia" w:hAnsiTheme="minorHAnsi"/>
           <w:noProof/>
+          <w:color w:val="auto"/>
+          <w:kern w:val="2"/>
+          <w:sz w:val="24"/>
+          <w:szCs w:val="24"/>
+          <w:lang w:val="es-CO" w:eastAsia="es-CO"/>
+          <w14:ligatures w14:val="standardContextual"/>
         </w:rPr>
       </w:pPr>
-      <w:hyperlink w:anchor="_Toc241156668" w:history="1">
+      <w:hyperlink w:anchor="_Toc241161855" w:history="1">
         <w:r>
           <w:rPr>
             <w:rStyle w:val="Hipervnculo"/>
@@ -993,7 +1042,7 @@
             <w:noProof/>
             <w:webHidden/>
           </w:rPr>
-          <w:instrText xml:space="preserve"> PAGEREF _Toc241156668 \h </w:instrText>
+          <w:instrText xml:space="preserve"> PAGEREF _Toc241161855 \h </w:instrText>
         </w:r>
         <w:r>
           <w:rPr>
@@ -1031,10 +1080,17 @@
           <w:tab w:val="right" w:leader="dot" w:pos="9628"/>
         </w:tabs>
         <w:rPr>
+          <w:rFonts w:asciiTheme="minorHAnsi" w:eastAsiaTheme="minorEastAsia" w:hAnsiTheme="minorHAnsi"/>
           <w:noProof/>
+          <w:color w:val="auto"/>
+          <w:kern w:val="2"/>
+          <w:sz w:val="24"/>
+          <w:szCs w:val="24"/>
+          <w:lang w:val="es-CO" w:eastAsia="es-CO"/>
+          <w14:ligatures w14:val="standardContextual"/>
         </w:rPr>
       </w:pPr>
-      <w:hyperlink w:anchor="_Toc241156669" w:history="1">
+      <w:hyperlink w:anchor="_Toc241161856" w:history="1">
         <w:r>
           <w:rPr>
             <w:rStyle w:val="Hipervnculo"/>
@@ -1061,7 +1117,7 @@
             <w:noProof/>
             <w:webHidden/>
           </w:rPr>
-          <w:instrText xml:space="preserve"> PAGEREF _Toc241156669 \h </w:instrText>
+          <w:instrText xml:space="preserve"> PAGEREF _Toc241161856 \h </w:instrText>
         </w:r>
         <w:r>
           <w:rPr>
@@ -1099,10 +1155,17 @@
           <w:tab w:val="right" w:leader="dot" w:pos="9628"/>
         </w:tabs>
         <w:rPr>
+          <w:rFonts w:asciiTheme="minorHAnsi" w:eastAsiaTheme="minorEastAsia" w:hAnsiTheme="minorHAnsi"/>
           <w:noProof/>
+          <w:color w:val="auto"/>
+          <w:kern w:val="2"/>
+          <w:sz w:val="24"/>
+          <w:szCs w:val="24"/>
+          <w:lang w:val="es-CO" w:eastAsia="es-CO"/>
+          <w14:ligatures w14:val="standardContextual"/>
         </w:rPr>
       </w:pPr>
-      <w:hyperlink w:anchor="_Toc241156670" w:history="1">
+      <w:hyperlink w:anchor="_Toc241161857" w:history="1">
         <w:r>
           <w:rPr>
             <w:rStyle w:val="Hipervnculo"/>
@@ -1129,7 +1192,7 @@
             <w:noProof/>
             <w:webHidden/>
           </w:rPr>
-          <w:instrText xml:space="preserve"> PAGEREF _Toc241156670 \h </w:instrText>
+          <w:instrText xml:space="preserve"> PAGEREF _Toc241161857 \h </w:instrText>
         </w:r>
         <w:r>
           <w:rPr>
@@ -1167,10 +1230,17 @@
           <w:tab w:val="right" w:leader="dot" w:pos="9628"/>
         </w:tabs>
         <w:rPr>
+          <w:rFonts w:asciiTheme="minorHAnsi" w:eastAsiaTheme="minorEastAsia" w:hAnsiTheme="minorHAnsi"/>
           <w:noProof/>
+          <w:color w:val="auto"/>
+          <w:kern w:val="2"/>
+          <w:sz w:val="24"/>
+          <w:szCs w:val="24"/>
+          <w:lang w:val="es-CO" w:eastAsia="es-CO"/>
+          <w14:ligatures w14:val="standardContextual"/>
         </w:rPr>
       </w:pPr>
-      <w:hyperlink w:anchor="_Toc241156671" w:history="1">
+      <w:hyperlink w:anchor="_Toc241161858" w:history="1">
         <w:r>
           <w:rPr>
             <w:rStyle w:val="Hipervnculo"/>
@@ -1197,7 +1267,7 @@
             <w:noProof/>
             <w:webHidden/>
           </w:rPr>
-          <w:instrText xml:space="preserve"> PAGEREF _Toc241156671 \h </w:instrText>
+          <w:instrText xml:space="preserve"> PAGEREF _Toc241161858 \h </w:instrText>
         </w:r>
         <w:r>
           <w:rPr>
@@ -1235,10 +1305,17 @@
           <w:tab w:val="right" w:leader="dot" w:pos="9628"/>
         </w:tabs>
         <w:rPr>
+          <w:rFonts w:asciiTheme="minorHAnsi" w:eastAsiaTheme="minorEastAsia" w:hAnsiTheme="minorHAnsi"/>
           <w:noProof/>
+          <w:color w:val="auto"/>
+          <w:kern w:val="2"/>
+          <w:sz w:val="24"/>
+          <w:szCs w:val="24"/>
+          <w:lang w:val="es-CO" w:eastAsia="es-CO"/>
+          <w14:ligatures w14:val="standardContextual"/>
         </w:rPr>
       </w:pPr>
-      <w:hyperlink w:anchor="_Toc241156672" w:history="1">
+      <w:hyperlink w:anchor="_Toc241161859" w:history="1">
         <w:r>
           <w:rPr>
             <w:rStyle w:val="Hipervnculo"/>
@@ -1265,7 +1342,7 @@
             <w:noProof/>
             <w:webHidden/>
           </w:rPr>
-          <w:instrText xml:space="preserve"> PAGEREF _Toc241156672 \h </w:instrText>
+          <w:instrText xml:space="preserve"> PAGEREF _Toc241161859 \h </w:instrText>
         </w:r>
         <w:r>
           <w:rPr>
@@ -1285,7 +1362,7 @@
             <w:noProof/>
             <w:webHidden/>
           </w:rPr>
-          <w:t>8</w:t>
+          <w:t>9</w:t>
         </w:r>
         <w:r>
           <w:rPr>
@@ -1303,10 +1380,17 @@
           <w:tab w:val="right" w:leader="dot" w:pos="9628"/>
         </w:tabs>
         <w:rPr>
+          <w:rFonts w:asciiTheme="minorHAnsi" w:eastAsiaTheme="minorEastAsia" w:hAnsiTheme="minorHAnsi"/>
           <w:noProof/>
+          <w:color w:val="auto"/>
+          <w:kern w:val="2"/>
+          <w:sz w:val="24"/>
+          <w:szCs w:val="24"/>
+          <w:lang w:val="es-CO" w:eastAsia="es-CO"/>
+          <w14:ligatures w14:val="standardContextual"/>
         </w:rPr>
       </w:pPr>
-      <w:hyperlink w:anchor="_Toc241156673" w:history="1">
+      <w:hyperlink w:anchor="_Toc241161860" w:history="1">
         <w:r>
           <w:rPr>
             <w:rStyle w:val="Hipervnculo"/>
@@ -1333,7 +1417,7 @@
             <w:noProof/>
             <w:webHidden/>
           </w:rPr>
-          <w:instrText xml:space="preserve"> PAGEREF _Toc241156673 \h </w:instrText>
+          <w:instrText xml:space="preserve"> PAGEREF _Toc241161860 \h </w:instrText>
         </w:r>
         <w:r>
           <w:rPr>
@@ -1353,7 +1437,7 @@
             <w:noProof/>
             <w:webHidden/>
           </w:rPr>
-          <w:t>8</w:t>
+          <w:t>9</w:t>
         </w:r>
         <w:r>
           <w:rPr>
@@ -1371,10 +1455,17 @@
           <w:tab w:val="right" w:leader="dot" w:pos="9628"/>
         </w:tabs>
         <w:rPr>
+          <w:rFonts w:asciiTheme="minorHAnsi" w:eastAsiaTheme="minorEastAsia" w:hAnsiTheme="minorHAnsi"/>
           <w:noProof/>
+          <w:color w:val="auto"/>
+          <w:kern w:val="2"/>
+          <w:sz w:val="24"/>
+          <w:szCs w:val="24"/>
+          <w:lang w:val="es-CO" w:eastAsia="es-CO"/>
+          <w14:ligatures w14:val="standardContextual"/>
         </w:rPr>
       </w:pPr>
-      <w:hyperlink w:anchor="_Toc241156674" w:history="1">
+      <w:hyperlink w:anchor="_Toc241161861" w:history="1">
         <w:r>
           <w:rPr>
             <w:rStyle w:val="Hipervnculo"/>
@@ -1401,7 +1492,7 @@
             <w:noProof/>
             <w:webHidden/>
           </w:rPr>
-          <w:instrText xml:space="preserve"> PAGEREF _Toc241156674 \h </w:instrText>
+          <w:instrText xml:space="preserve"> PAGEREF _Toc241161861 \h </w:instrText>
         </w:r>
         <w:r>
           <w:rPr>
@@ -1421,7 +1512,7 @@
             <w:noProof/>
             <w:webHidden/>
           </w:rPr>
-          <w:t>10</w:t>
+          <w:t>11</w:t>
         </w:r>
         <w:r>
           <w:rPr>
@@ -1439,10 +1530,17 @@
           <w:tab w:val="right" w:leader="dot" w:pos="9628"/>
         </w:tabs>
         <w:rPr>
+          <w:rFonts w:asciiTheme="minorHAnsi" w:eastAsiaTheme="minorEastAsia" w:hAnsiTheme="minorHAnsi"/>
           <w:noProof/>
+          <w:color w:val="auto"/>
+          <w:kern w:val="2"/>
+          <w:sz w:val="24"/>
+          <w:szCs w:val="24"/>
+          <w:lang w:val="es-CO" w:eastAsia="es-CO"/>
+          <w14:ligatures w14:val="standardContextual"/>
         </w:rPr>
       </w:pPr>
-      <w:hyperlink w:anchor="_Toc241156675" w:history="1">
+      <w:hyperlink w:anchor="_Toc241161862" w:history="1">
         <w:r>
           <w:rPr>
             <w:rStyle w:val="Hipervnculo"/>
@@ -1469,7 +1567,7 @@
             <w:noProof/>
             <w:webHidden/>
           </w:rPr>
-          <w:instrText xml:space="preserve"> PAGEREF _Toc241156675 \h </w:instrText>
+          <w:instrText xml:space="preserve"> PAGEREF _Toc241161862 \h </w:instrText>
         </w:r>
         <w:r>
           <w:rPr>
@@ -1489,7 +1587,7 @@
             <w:noProof/>
             <w:webHidden/>
           </w:rPr>
-          <w:t>10</w:t>
+          <w:t>11</w:t>
         </w:r>
         <w:r>
           <w:rPr>
@@ -1514,7 +1612,7 @@
       <w:pPr>
         <w:pStyle w:val="Ttulo1"/>
       </w:pPr>
-      <w:bookmarkStart w:id="0" w:name="_Toc241156662"/>
+      <w:bookmarkStart w:id="0" w:name="_Toc241161849"/>
       <w:r>
         <w:lastRenderedPageBreak/>
         <w:t>Historial de versiones</w:t>
@@ -2978,7 +3076,7 @@
       <w:pPr>
         <w:pStyle w:val="Ttulo1"/>
       </w:pPr>
-      <w:bookmarkStart w:id="1" w:name="_Toc241156663"/>
+      <w:bookmarkStart w:id="1" w:name="_Toc241161850"/>
       <w:r>
         <w:lastRenderedPageBreak/>
         <w:t>1. Resumen ejecutivo</w:t>
@@ -2987,10 +3085,7 @@
     </w:p>
     <w:p>
       <w:r>
-        <w:t>El proyecto despliega un escenario completo de centro de datos sobre Azure IoT Central. La flota no se llenó con un solo simulador: cada uno de los diez dispositivos declara un origen de envío distinto (simulador nativo de la plantilla, dos ESP32 virtuales en Wokwi, tres scripts Python con transportes y códigos diferentes, un replay de CSV histórico, un puente HTTP/REST y dos feeds de API pública). Sobre esa flota se configuraron vistas de operador, reglas con alertas y un panel tipo cuarto de control con i</w:t>
-      </w:r>
-      <w:r>
-        <w:t>dentidad visual propia, y se mantiene una ventana de métricas de cuatro días no continuos.</w:t>
+        <w:t>El proyecto despliega un escenario completo de centro de datos sobre Azure IoT Central. La flota no se llenó con un solo simulador: cada uno de los diez dispositivos declara un origen de envío distinto (simulador nativo de la plantilla, dos ESP32 virtuales en Wokwi, tres scripts Python con transportes y códigos diferentes, un replay de CSV histórico, un puente HTTP/REST y dos feeds de API pública). Sobre esa flota se configuraron vistas de operador, reglas con alertas y un panel tipo cuarto de control con identidad visual propia, y se mantiene una ventana de métricas de cuatro días no continuos.</w:t>
       </w:r>
     </w:p>
     <w:tbl>
@@ -3310,7 +3405,7 @@
       <w:pPr>
         <w:pStyle w:val="Ttulo1"/>
       </w:pPr>
-      <w:bookmarkStart w:id="2" w:name="_Toc241156664"/>
+      <w:bookmarkStart w:id="2" w:name="_Toc241161851"/>
       <w:r>
         <w:t>2. Escenario seleccionado y objetivo de operación</w:t>
       </w:r>
@@ -4242,7 +4337,7 @@
       <w:pPr>
         <w:pStyle w:val="Ttulo1"/>
       </w:pPr>
-      <w:bookmarkStart w:id="3" w:name="_Toc241156665"/>
+      <w:bookmarkStart w:id="3" w:name="_Toc241161852"/>
       <w:r>
         <w:lastRenderedPageBreak/>
         <w:t>3. Arquitectura de referencia con telecomunicaciones</w:t>
@@ -4782,7 +4877,7 @@
           <w:noProof/>
         </w:rPr>
         <w:drawing>
-          <wp:inline distT="0" distB="0" distL="0" distR="0" wp14:anchorId="3455FC99" wp14:editId="61C857FD">
+          <wp:inline distT="0" distB="0" distL="0" distR="0" wp14:anchorId="3584122E" wp14:editId="26BA4A93">
             <wp:extent cx="5940000" cy="3903429"/>
             <wp:effectExtent l="0" t="0" r="0" b="0"/>
             <wp:docPr id="1" name="Picture 1"/>
@@ -4844,7 +4939,7 @@
       <w:pPr>
         <w:pStyle w:val="Ttulo1"/>
       </w:pPr>
-      <w:bookmarkStart w:id="4" w:name="_Toc241156666"/>
+      <w:bookmarkStart w:id="4" w:name="_Toc241161853"/>
       <w:r>
         <w:t>4. Catálogo de 10 dispositivos (un solo inventario)</w:t>
       </w:r>
@@ -7345,7 +7440,7 @@
       <w:pPr>
         <w:pStyle w:val="Ttulo1"/>
       </w:pPr>
-      <w:bookmarkStart w:id="5" w:name="_Toc241156667"/>
+      <w:bookmarkStart w:id="5" w:name="_Toc241161854"/>
       <w:r>
         <w:t>5. Digital Twin (plantilla) y operación</w:t>
       </w:r>
@@ -7721,7 +7816,7 @@
       <w:pPr>
         <w:pStyle w:val="Ttulo1"/>
       </w:pPr>
-      <w:bookmarkStart w:id="6" w:name="_Toc241156668"/>
+      <w:bookmarkStart w:id="6" w:name="_Toc241161855"/>
       <w:r>
         <w:t>6. Asincronía, desconexión y operación en línea</w:t>
       </w:r>
@@ -8671,7 +8766,7 @@
       <w:pPr>
         <w:pStyle w:val="Ttulo1"/>
       </w:pPr>
-      <w:bookmarkStart w:id="7" w:name="_Toc241156669"/>
+      <w:bookmarkStart w:id="7" w:name="_Toc241161856"/>
       <w:r>
         <w:t>7. Ventana de 4 días no continuos</w:t>
       </w:r>
@@ -8740,7 +8835,7 @@
       <w:pPr>
         <w:pStyle w:val="Ttulo1"/>
       </w:pPr>
-      <w:bookmarkStart w:id="8" w:name="_Toc241156670"/>
+      <w:bookmarkStart w:id="8" w:name="_Toc241161857"/>
       <w:r>
         <w:t>8. Cuarto de control</w:t>
       </w:r>
@@ -9186,11 +9281,16 @@
       <w:pPr>
         <w:pStyle w:val="Ttulo1"/>
       </w:pPr>
-      <w:bookmarkStart w:id="9" w:name="_Toc241156671"/>
+      <w:bookmarkStart w:id="9" w:name="_Toc241161858"/>
       <w:r>
         <w:t>9. Reglas y alertas</w:t>
       </w:r>
       <w:bookmarkEnd w:id="9"/>
+    </w:p>
+    <w:p>
+      <w:r>
+        <w:t>La aplicación tiene seis reglas creadas sobre la plantilla Nodo DC-ANDES-1 y habilitadas en la plataforma (evidencia E6). Cada regla evalúa una telemetría del modelo contra un umbral operativo y dispara una acción de correo electrónico a la cuenta del operador; los umbrales coinciden con los del anexo A y con los que publican los nodos.</w:t>
+      </w:r>
     </w:p>
     <w:tbl>
       <w:tblPr>
@@ -9199,9 +9299,11 @@
         <w:tblLook w:val="04A0" w:firstRow="1" w:lastRow="0" w:firstColumn="1" w:lastColumn="0" w:noHBand="0" w:noVBand="1"/>
       </w:tblPr>
       <w:tblGrid>
-        <w:gridCol w:w="2835"/>
-        <w:gridCol w:w="3118"/>
-        <w:gridCol w:w="3288"/>
+        <w:gridCol w:w="454"/>
+        <w:gridCol w:w="2948"/>
+        <w:gridCol w:w="2551"/>
+        <w:gridCol w:w="1134"/>
+        <w:gridCol w:w="2154"/>
       </w:tblGrid>
       <w:tr>
         <w:trPr>
@@ -9211,7 +9313,7 @@
         </w:trPr>
         <w:tc>
           <w:tcPr>
-            <w:tcW w:w="2835" w:type="dxa"/>
+            <w:tcW w:w="454" w:type="dxa"/>
             <w:tcBorders>
               <w:top w:val="single" w:sz="4" w:space="0" w:color="0B2A4A"/>
               <w:left w:val="single" w:sz="4" w:space="0" w:color="0B2A4A"/>
@@ -9237,13 +9339,13 @@
                 <w:color w:val="FFFFFF"/>
                 <w:sz w:val="19"/>
               </w:rPr>
-              <w:t>Regla</w:t>
-            </w:r>
-          </w:p>
-        </w:tc>
-        <w:tc>
-          <w:tcPr>
-            <w:tcW w:w="3118" w:type="dxa"/>
+              <w:t>#</w:t>
+            </w:r>
+          </w:p>
+        </w:tc>
+        <w:tc>
+          <w:tcPr>
+            <w:tcW w:w="2948" w:type="dxa"/>
             <w:tcBorders>
               <w:top w:val="single" w:sz="4" w:space="0" w:color="0B2A4A"/>
               <w:left w:val="single" w:sz="4" w:space="0" w:color="0B2A4A"/>
@@ -9269,13 +9371,13 @@
                 <w:color w:val="FFFFFF"/>
                 <w:sz w:val="19"/>
               </w:rPr>
-              <w:t>Condición</w:t>
-            </w:r>
-          </w:p>
-        </w:tc>
-        <w:tc>
-          <w:tcPr>
-            <w:tcW w:w="3288" w:type="dxa"/>
+              <w:t>Regla (nombre en Central)</w:t>
+            </w:r>
+          </w:p>
+        </w:tc>
+        <w:tc>
+          <w:tcPr>
+            <w:tcW w:w="2551" w:type="dxa"/>
             <w:tcBorders>
               <w:top w:val="single" w:sz="4" w:space="0" w:color="0B2A4A"/>
               <w:left w:val="single" w:sz="4" w:space="0" w:color="0B2A4A"/>
@@ -9301,7 +9403,71 @@
                 <w:color w:val="FFFFFF"/>
                 <w:sz w:val="19"/>
               </w:rPr>
+              <w:t>Condición</w:t>
+            </w:r>
+          </w:p>
+        </w:tc>
+        <w:tc>
+          <w:tcPr>
+            <w:tcW w:w="1134" w:type="dxa"/>
+            <w:tcBorders>
+              <w:top w:val="single" w:sz="4" w:space="0" w:color="0B2A4A"/>
+              <w:left w:val="single" w:sz="4" w:space="0" w:color="0B2A4A"/>
+              <w:bottom w:val="single" w:sz="4" w:space="0" w:color="0B2A4A"/>
+              <w:right w:val="single" w:sz="4" w:space="0" w:color="0B2A4A"/>
+            </w:tcBorders>
+            <w:shd w:val="clear" w:color="auto" w:fill="0B2A4A"/>
+            <w:tcMar>
+              <w:top w:w="90" w:type="dxa"/>
+              <w:left w:w="130" w:type="dxa"/>
+              <w:bottom w:w="90" w:type="dxa"/>
+              <w:right w:w="130" w:type="dxa"/>
+            </w:tcMar>
+            <w:vAlign w:val="center"/>
+          </w:tcPr>
+          <w:p>
+            <w:pPr>
+              <w:keepNext/>
+            </w:pPr>
+            <w:r>
+              <w:rPr>
+                <w:b/>
+                <w:color w:val="FFFFFF"/>
+                <w:sz w:val="19"/>
+              </w:rPr>
               <w:t>Acción</w:t>
+            </w:r>
+          </w:p>
+        </w:tc>
+        <w:tc>
+          <w:tcPr>
+            <w:tcW w:w="2154" w:type="dxa"/>
+            <w:tcBorders>
+              <w:top w:val="single" w:sz="4" w:space="0" w:color="0B2A4A"/>
+              <w:left w:val="single" w:sz="4" w:space="0" w:color="0B2A4A"/>
+              <w:bottom w:val="single" w:sz="4" w:space="0" w:color="0B2A4A"/>
+              <w:right w:val="single" w:sz="4" w:space="0" w:color="0B2A4A"/>
+            </w:tcBorders>
+            <w:shd w:val="clear" w:color="auto" w:fill="0B2A4A"/>
+            <w:tcMar>
+              <w:top w:w="90" w:type="dxa"/>
+              <w:left w:w="130" w:type="dxa"/>
+              <w:bottom w:w="90" w:type="dxa"/>
+              <w:right w:w="130" w:type="dxa"/>
+            </w:tcMar>
+            <w:vAlign w:val="center"/>
+          </w:tcPr>
+          <w:p>
+            <w:pPr>
+              <w:keepNext/>
+            </w:pPr>
+            <w:r>
+              <w:rPr>
+                <w:b/>
+                <w:color w:val="FFFFFF"/>
+                <w:sz w:val="19"/>
+              </w:rPr>
+              <w:t>Id</w:t>
             </w:r>
           </w:p>
         </w:tc>
@@ -9313,7 +9479,7 @@
         </w:trPr>
         <w:tc>
           <w:tcPr>
-            <w:tcW w:w="2835" w:type="dxa"/>
+            <w:tcW w:w="454" w:type="dxa"/>
             <w:tcBorders>
               <w:top w:val="single" w:sz="4" w:space="0" w:color="D0D7DE"/>
               <w:left w:val="single" w:sz="4" w:space="0" w:color="D0D7DE"/>
@@ -9339,13 +9505,13 @@
                 <w:b/>
                 <w:sz w:val="19"/>
               </w:rPr>
-              <w:t>Temperatura de rack alta</w:t>
-            </w:r>
-          </w:p>
-        </w:tc>
-        <w:tc>
-          <w:tcPr>
-            <w:tcW w:w="3118" w:type="dxa"/>
+              <w:t>1</w:t>
+            </w:r>
+          </w:p>
+        </w:tc>
+        <w:tc>
+          <w:tcPr>
+            <w:tcW w:w="2948" w:type="dxa"/>
             <w:tcBorders>
               <w:top w:val="single" w:sz="4" w:space="0" w:color="D0D7DE"/>
               <w:left w:val="single" w:sz="4" w:space="0" w:color="D0D7DE"/>
@@ -9370,13 +9536,44 @@
               <w:rPr>
                 <w:sz w:val="19"/>
               </w:rPr>
+              <w:t>Alerta temperatura de rack</w:t>
+            </w:r>
+          </w:p>
+        </w:tc>
+        <w:tc>
+          <w:tcPr>
+            <w:tcW w:w="2551" w:type="dxa"/>
+            <w:tcBorders>
+              <w:top w:val="single" w:sz="4" w:space="0" w:color="D0D7DE"/>
+              <w:left w:val="single" w:sz="4" w:space="0" w:color="D0D7DE"/>
+              <w:bottom w:val="single" w:sz="4" w:space="0" w:color="D0D7DE"/>
+              <w:right w:val="single" w:sz="4" w:space="0" w:color="D0D7DE"/>
+            </w:tcBorders>
+            <w:shd w:val="clear" w:color="auto" w:fill="FFFFFF"/>
+            <w:tcMar>
+              <w:top w:w="90" w:type="dxa"/>
+              <w:left w:w="130" w:type="dxa"/>
+              <w:bottom w:w="90" w:type="dxa"/>
+              <w:right w:w="130" w:type="dxa"/>
+            </w:tcMar>
+            <w:vAlign w:val="center"/>
+          </w:tcPr>
+          <w:p>
+            <w:pPr>
+              <w:keepNext/>
+              <w:spacing w:after="0"/>
+            </w:pPr>
+            <w:r>
+              <w:rPr>
+                <w:sz w:val="19"/>
+              </w:rPr>
               <w:t>tempExhaust &gt; 35 °C</w:t>
             </w:r>
           </w:p>
         </w:tc>
         <w:tc>
           <w:tcPr>
-            <w:tcW w:w="3288" w:type="dxa"/>
+            <w:tcW w:w="1134" w:type="dxa"/>
             <w:tcBorders>
               <w:top w:val="single" w:sz="4" w:space="0" w:color="D0D7DE"/>
               <w:left w:val="single" w:sz="4" w:space="0" w:color="D0D7DE"/>
@@ -9401,7 +9598,38 @@
               <w:rPr>
                 <w:sz w:val="19"/>
               </w:rPr>
-              <w:t>correo + webhook</w:t>
+              <w:t>correo</w:t>
+            </w:r>
+          </w:p>
+        </w:tc>
+        <w:tc>
+          <w:tcPr>
+            <w:tcW w:w="2154" w:type="dxa"/>
+            <w:tcBorders>
+              <w:top w:val="single" w:sz="4" w:space="0" w:color="D0D7DE"/>
+              <w:left w:val="single" w:sz="4" w:space="0" w:color="D0D7DE"/>
+              <w:bottom w:val="single" w:sz="4" w:space="0" w:color="D0D7DE"/>
+              <w:right w:val="single" w:sz="4" w:space="0" w:color="D0D7DE"/>
+            </w:tcBorders>
+            <w:shd w:val="clear" w:color="auto" w:fill="FFFFFF"/>
+            <w:tcMar>
+              <w:top w:w="90" w:type="dxa"/>
+              <w:left w:w="130" w:type="dxa"/>
+              <w:bottom w:w="90" w:type="dxa"/>
+              <w:right w:w="130" w:type="dxa"/>
+            </w:tcMar>
+            <w:vAlign w:val="center"/>
+          </w:tcPr>
+          <w:p>
+            <w:pPr>
+              <w:keepNext/>
+              <w:spacing w:after="0"/>
+            </w:pPr>
+            <w:r>
+              <w:rPr>
+                <w:sz w:val="19"/>
+              </w:rPr>
+              <w:t>067173ba…</w:t>
             </w:r>
           </w:p>
         </w:tc>
@@ -9413,7 +9641,7 @@
         </w:trPr>
         <w:tc>
           <w:tcPr>
-            <w:tcW w:w="2835" w:type="dxa"/>
+            <w:tcW w:w="454" w:type="dxa"/>
             <w:tcBorders>
               <w:top w:val="single" w:sz="4" w:space="0" w:color="D0D7DE"/>
               <w:left w:val="single" w:sz="4" w:space="0" w:color="D0D7DE"/>
@@ -9439,13 +9667,13 @@
                 <w:b/>
                 <w:sz w:val="19"/>
               </w:rPr>
-              <w:t>Humedad de rack fuera de banda</w:t>
-            </w:r>
-          </w:p>
-        </w:tc>
-        <w:tc>
-          <w:tcPr>
-            <w:tcW w:w="3118" w:type="dxa"/>
+              <w:t>2</w:t>
+            </w:r>
+          </w:p>
+        </w:tc>
+        <w:tc>
+          <w:tcPr>
+            <w:tcW w:w="2948" w:type="dxa"/>
             <w:tcBorders>
               <w:top w:val="single" w:sz="4" w:space="0" w:color="D0D7DE"/>
               <w:left w:val="single" w:sz="4" w:space="0" w:color="D0D7DE"/>
@@ -9470,13 +9698,44 @@
               <w:rPr>
                 <w:sz w:val="19"/>
               </w:rPr>
+              <w:t>Alerta humedad de rack</w:t>
+            </w:r>
+          </w:p>
+        </w:tc>
+        <w:tc>
+          <w:tcPr>
+            <w:tcW w:w="2551" w:type="dxa"/>
+            <w:tcBorders>
+              <w:top w:val="single" w:sz="4" w:space="0" w:color="D0D7DE"/>
+              <w:left w:val="single" w:sz="4" w:space="0" w:color="D0D7DE"/>
+              <w:bottom w:val="single" w:sz="4" w:space="0" w:color="D0D7DE"/>
+              <w:right w:val="single" w:sz="4" w:space="0" w:color="D0D7DE"/>
+            </w:tcBorders>
+            <w:shd w:val="clear" w:color="auto" w:fill="F4F7FB"/>
+            <w:tcMar>
+              <w:top w:w="90" w:type="dxa"/>
+              <w:left w:w="130" w:type="dxa"/>
+              <w:bottom w:w="90" w:type="dxa"/>
+              <w:right w:w="130" w:type="dxa"/>
+            </w:tcMar>
+            <w:vAlign w:val="center"/>
+          </w:tcPr>
+          <w:p>
+            <w:pPr>
+              <w:keepNext/>
+              <w:spacing w:after="0"/>
+            </w:pPr>
+            <w:r>
+              <w:rPr>
+                <w:sz w:val="19"/>
+              </w:rPr>
               <w:t>humedadRack &gt; 60 %HR</w:t>
             </w:r>
           </w:p>
         </w:tc>
         <w:tc>
           <w:tcPr>
-            <w:tcW w:w="3288" w:type="dxa"/>
+            <w:tcW w:w="1134" w:type="dxa"/>
             <w:tcBorders>
               <w:top w:val="single" w:sz="4" w:space="0" w:color="D0D7DE"/>
               <w:left w:val="single" w:sz="4" w:space="0" w:color="D0D7DE"/>
@@ -9502,6 +9761,37 @@
                 <w:sz w:val="19"/>
               </w:rPr>
               <w:t>correo</w:t>
+            </w:r>
+          </w:p>
+        </w:tc>
+        <w:tc>
+          <w:tcPr>
+            <w:tcW w:w="2154" w:type="dxa"/>
+            <w:tcBorders>
+              <w:top w:val="single" w:sz="4" w:space="0" w:color="D0D7DE"/>
+              <w:left w:val="single" w:sz="4" w:space="0" w:color="D0D7DE"/>
+              <w:bottom w:val="single" w:sz="4" w:space="0" w:color="D0D7DE"/>
+              <w:right w:val="single" w:sz="4" w:space="0" w:color="D0D7DE"/>
+            </w:tcBorders>
+            <w:shd w:val="clear" w:color="auto" w:fill="F4F7FB"/>
+            <w:tcMar>
+              <w:top w:w="90" w:type="dxa"/>
+              <w:left w:w="130" w:type="dxa"/>
+              <w:bottom w:w="90" w:type="dxa"/>
+              <w:right w:w="130" w:type="dxa"/>
+            </w:tcMar>
+            <w:vAlign w:val="center"/>
+          </w:tcPr>
+          <w:p>
+            <w:pPr>
+              <w:keepNext/>
+              <w:spacing w:after="0"/>
+            </w:pPr>
+            <w:r>
+              <w:rPr>
+                <w:sz w:val="19"/>
+              </w:rPr>
+              <w:t>7ac863ed…</w:t>
             </w:r>
           </w:p>
         </w:tc>
@@ -9513,7 +9803,7 @@
         </w:trPr>
         <w:tc>
           <w:tcPr>
-            <w:tcW w:w="2835" w:type="dxa"/>
+            <w:tcW w:w="454" w:type="dxa"/>
             <w:tcBorders>
               <w:top w:val="single" w:sz="4" w:space="0" w:color="D0D7DE"/>
               <w:left w:val="single" w:sz="4" w:space="0" w:color="D0D7DE"/>
@@ -9539,13 +9829,13 @@
                 <w:b/>
                 <w:sz w:val="19"/>
               </w:rPr>
-              <w:t>Fuga de agua</w:t>
-            </w:r>
-          </w:p>
-        </w:tc>
-        <w:tc>
-          <w:tcPr>
-            <w:tcW w:w="3118" w:type="dxa"/>
+              <w:t>3</w:t>
+            </w:r>
+          </w:p>
+        </w:tc>
+        <w:tc>
+          <w:tcPr>
+            <w:tcW w:w="2948" w:type="dxa"/>
             <w:tcBorders>
               <w:top w:val="single" w:sz="4" w:space="0" w:color="D0D7DE"/>
               <w:left w:val="single" w:sz="4" w:space="0" w:color="D0D7DE"/>
@@ -9570,13 +9860,13 @@
               <w:rPr>
                 <w:sz w:val="19"/>
               </w:rPr>
-              <w:t>fugaAgua = true</w:t>
-            </w:r>
-          </w:p>
-        </w:tc>
-        <w:tc>
-          <w:tcPr>
-            <w:tcW w:w="3288" w:type="dxa"/>
+              <w:t>Humo detectado en sala</w:t>
+            </w:r>
+          </w:p>
+        </w:tc>
+        <w:tc>
+          <w:tcPr>
+            <w:tcW w:w="2551" w:type="dxa"/>
             <w:tcBorders>
               <w:top w:val="single" w:sz="4" w:space="0" w:color="D0D7DE"/>
               <w:left w:val="single" w:sz="4" w:space="0" w:color="D0D7DE"/>
@@ -9601,7 +9891,69 @@
               <w:rPr>
                 <w:sz w:val="19"/>
               </w:rPr>
-              <w:t>correo + webhook</w:t>
+              <w:t>humo &gt; 0,08 %obs/m</w:t>
+            </w:r>
+          </w:p>
+        </w:tc>
+        <w:tc>
+          <w:tcPr>
+            <w:tcW w:w="1134" w:type="dxa"/>
+            <w:tcBorders>
+              <w:top w:val="single" w:sz="4" w:space="0" w:color="D0D7DE"/>
+              <w:left w:val="single" w:sz="4" w:space="0" w:color="D0D7DE"/>
+              <w:bottom w:val="single" w:sz="4" w:space="0" w:color="D0D7DE"/>
+              <w:right w:val="single" w:sz="4" w:space="0" w:color="D0D7DE"/>
+            </w:tcBorders>
+            <w:shd w:val="clear" w:color="auto" w:fill="FFFFFF"/>
+            <w:tcMar>
+              <w:top w:w="90" w:type="dxa"/>
+              <w:left w:w="130" w:type="dxa"/>
+              <w:bottom w:w="90" w:type="dxa"/>
+              <w:right w:w="130" w:type="dxa"/>
+            </w:tcMar>
+            <w:vAlign w:val="center"/>
+          </w:tcPr>
+          <w:p>
+            <w:pPr>
+              <w:keepNext/>
+              <w:spacing w:after="0"/>
+            </w:pPr>
+            <w:r>
+              <w:rPr>
+                <w:sz w:val="19"/>
+              </w:rPr>
+              <w:t>correo</w:t>
+            </w:r>
+          </w:p>
+        </w:tc>
+        <w:tc>
+          <w:tcPr>
+            <w:tcW w:w="2154" w:type="dxa"/>
+            <w:tcBorders>
+              <w:top w:val="single" w:sz="4" w:space="0" w:color="D0D7DE"/>
+              <w:left w:val="single" w:sz="4" w:space="0" w:color="D0D7DE"/>
+              <w:bottom w:val="single" w:sz="4" w:space="0" w:color="D0D7DE"/>
+              <w:right w:val="single" w:sz="4" w:space="0" w:color="D0D7DE"/>
+            </w:tcBorders>
+            <w:shd w:val="clear" w:color="auto" w:fill="FFFFFF"/>
+            <w:tcMar>
+              <w:top w:w="90" w:type="dxa"/>
+              <w:left w:w="130" w:type="dxa"/>
+              <w:bottom w:w="90" w:type="dxa"/>
+              <w:right w:w="130" w:type="dxa"/>
+            </w:tcMar>
+            <w:vAlign w:val="center"/>
+          </w:tcPr>
+          <w:p>
+            <w:pPr>
+              <w:keepNext/>
+              <w:spacing w:after="0"/>
+            </w:pPr>
+            <w:r>
+              <w:rPr>
+                <w:sz w:val="19"/>
+              </w:rPr>
+              <w:t>6a579d61…</w:t>
             </w:r>
           </w:p>
         </w:tc>
@@ -9613,7 +9965,7 @@
         </w:trPr>
         <w:tc>
           <w:tcPr>
-            <w:tcW w:w="2835" w:type="dxa"/>
+            <w:tcW w:w="454" w:type="dxa"/>
             <w:tcBorders>
               <w:top w:val="single" w:sz="4" w:space="0" w:color="D0D7DE"/>
               <w:left w:val="single" w:sz="4" w:space="0" w:color="D0D7DE"/>
@@ -9639,13 +9991,13 @@
                 <w:b/>
                 <w:sz w:val="19"/>
               </w:rPr>
-              <w:t>Humo detectado</w:t>
-            </w:r>
-          </w:p>
-        </w:tc>
-        <w:tc>
-          <w:tcPr>
-            <w:tcW w:w="3118" w:type="dxa"/>
+              <w:t>4</w:t>
+            </w:r>
+          </w:p>
+        </w:tc>
+        <w:tc>
+          <w:tcPr>
+            <w:tcW w:w="2948" w:type="dxa"/>
             <w:tcBorders>
               <w:top w:val="single" w:sz="4" w:space="0" w:color="D0D7DE"/>
               <w:left w:val="single" w:sz="4" w:space="0" w:color="D0D7DE"/>
@@ -9670,13 +10022,13 @@
               <w:rPr>
                 <w:sz w:val="19"/>
               </w:rPr>
-              <w:t>humo &gt; 0,08 %obs/m</w:t>
-            </w:r>
-          </w:p>
-        </w:tc>
-        <w:tc>
-          <w:tcPr>
-            <w:tcW w:w="3288" w:type="dxa"/>
+              <w:t>Calidad de aire degradada</w:t>
+            </w:r>
+          </w:p>
+        </w:tc>
+        <w:tc>
+          <w:tcPr>
+            <w:tcW w:w="2551" w:type="dxa"/>
             <w:tcBorders>
               <w:top w:val="single" w:sz="4" w:space="0" w:color="D0D7DE"/>
               <w:left w:val="single" w:sz="4" w:space="0" w:color="D0D7DE"/>
@@ -9701,7 +10053,69 @@
               <w:rPr>
                 <w:sz w:val="19"/>
               </w:rPr>
-              <w:t>correo + webhook</w:t>
+              <w:t>pm25 &gt; 35 µg/m³</w:t>
+            </w:r>
+          </w:p>
+        </w:tc>
+        <w:tc>
+          <w:tcPr>
+            <w:tcW w:w="1134" w:type="dxa"/>
+            <w:tcBorders>
+              <w:top w:val="single" w:sz="4" w:space="0" w:color="D0D7DE"/>
+              <w:left w:val="single" w:sz="4" w:space="0" w:color="D0D7DE"/>
+              <w:bottom w:val="single" w:sz="4" w:space="0" w:color="D0D7DE"/>
+              <w:right w:val="single" w:sz="4" w:space="0" w:color="D0D7DE"/>
+            </w:tcBorders>
+            <w:shd w:val="clear" w:color="auto" w:fill="F4F7FB"/>
+            <w:tcMar>
+              <w:top w:w="90" w:type="dxa"/>
+              <w:left w:w="130" w:type="dxa"/>
+              <w:bottom w:w="90" w:type="dxa"/>
+              <w:right w:w="130" w:type="dxa"/>
+            </w:tcMar>
+            <w:vAlign w:val="center"/>
+          </w:tcPr>
+          <w:p>
+            <w:pPr>
+              <w:keepNext/>
+              <w:spacing w:after="0"/>
+            </w:pPr>
+            <w:r>
+              <w:rPr>
+                <w:sz w:val="19"/>
+              </w:rPr>
+              <w:t>correo</w:t>
+            </w:r>
+          </w:p>
+        </w:tc>
+        <w:tc>
+          <w:tcPr>
+            <w:tcW w:w="2154" w:type="dxa"/>
+            <w:tcBorders>
+              <w:top w:val="single" w:sz="4" w:space="0" w:color="D0D7DE"/>
+              <w:left w:val="single" w:sz="4" w:space="0" w:color="D0D7DE"/>
+              <w:bottom w:val="single" w:sz="4" w:space="0" w:color="D0D7DE"/>
+              <w:right w:val="single" w:sz="4" w:space="0" w:color="D0D7DE"/>
+            </w:tcBorders>
+            <w:shd w:val="clear" w:color="auto" w:fill="F4F7FB"/>
+            <w:tcMar>
+              <w:top w:w="90" w:type="dxa"/>
+              <w:left w:w="130" w:type="dxa"/>
+              <w:bottom w:w="90" w:type="dxa"/>
+              <w:right w:w="130" w:type="dxa"/>
+            </w:tcMar>
+            <w:vAlign w:val="center"/>
+          </w:tcPr>
+          <w:p>
+            <w:pPr>
+              <w:keepNext/>
+              <w:spacing w:after="0"/>
+            </w:pPr>
+            <w:r>
+              <w:rPr>
+                <w:sz w:val="19"/>
+              </w:rPr>
+              <w:t>—</w:t>
             </w:r>
           </w:p>
         </w:tc>
@@ -9713,7 +10127,7 @@
         </w:trPr>
         <w:tc>
           <w:tcPr>
-            <w:tcW w:w="2835" w:type="dxa"/>
+            <w:tcW w:w="454" w:type="dxa"/>
             <w:tcBorders>
               <w:top w:val="single" w:sz="4" w:space="0" w:color="D0D7DE"/>
               <w:left w:val="single" w:sz="4" w:space="0" w:color="D0D7DE"/>
@@ -9739,13 +10153,13 @@
                 <w:b/>
                 <w:sz w:val="19"/>
               </w:rPr>
-              <w:t>Calidad de aire degradada</w:t>
-            </w:r>
-          </w:p>
-        </w:tc>
-        <w:tc>
-          <w:tcPr>
-            <w:tcW w:w="3118" w:type="dxa"/>
+              <w:t>5</w:t>
+            </w:r>
+          </w:p>
+        </w:tc>
+        <w:tc>
+          <w:tcPr>
+            <w:tcW w:w="2948" w:type="dxa"/>
             <w:tcBorders>
               <w:top w:val="single" w:sz="4" w:space="0" w:color="D0D7DE"/>
               <w:left w:val="single" w:sz="4" w:space="0" w:color="D0D7DE"/>
@@ -9770,13 +10184,13 @@
               <w:rPr>
                 <w:sz w:val="19"/>
               </w:rPr>
-              <w:t>pm25 &gt; 35 µg/m³</w:t>
-            </w:r>
-          </w:p>
-        </w:tc>
-        <w:tc>
-          <w:tcPr>
-            <w:tcW w:w="3288" w:type="dxa"/>
+              <w:t>Alerta humedad en piso tecnico</w:t>
+            </w:r>
+          </w:p>
+        </w:tc>
+        <w:tc>
+          <w:tcPr>
+            <w:tcW w:w="2551" w:type="dxa"/>
             <w:tcBorders>
               <w:top w:val="single" w:sz="4" w:space="0" w:color="D0D7DE"/>
               <w:left w:val="single" w:sz="4" w:space="0" w:color="D0D7DE"/>
@@ -9801,7 +10215,69 @@
               <w:rPr>
                 <w:sz w:val="19"/>
               </w:rPr>
+              <w:t>humedadPiso &gt; 70 %</w:t>
+            </w:r>
+          </w:p>
+        </w:tc>
+        <w:tc>
+          <w:tcPr>
+            <w:tcW w:w="1134" w:type="dxa"/>
+            <w:tcBorders>
+              <w:top w:val="single" w:sz="4" w:space="0" w:color="D0D7DE"/>
+              <w:left w:val="single" w:sz="4" w:space="0" w:color="D0D7DE"/>
+              <w:bottom w:val="single" w:sz="4" w:space="0" w:color="D0D7DE"/>
+              <w:right w:val="single" w:sz="4" w:space="0" w:color="D0D7DE"/>
+            </w:tcBorders>
+            <w:shd w:val="clear" w:color="auto" w:fill="FFFFFF"/>
+            <w:tcMar>
+              <w:top w:w="90" w:type="dxa"/>
+              <w:left w:w="130" w:type="dxa"/>
+              <w:bottom w:w="90" w:type="dxa"/>
+              <w:right w:w="130" w:type="dxa"/>
+            </w:tcMar>
+            <w:vAlign w:val="center"/>
+          </w:tcPr>
+          <w:p>
+            <w:pPr>
+              <w:keepNext/>
+              <w:spacing w:after="0"/>
+            </w:pPr>
+            <w:r>
+              <w:rPr>
+                <w:sz w:val="19"/>
+              </w:rPr>
               <w:t>correo</w:t>
+            </w:r>
+          </w:p>
+        </w:tc>
+        <w:tc>
+          <w:tcPr>
+            <w:tcW w:w="2154" w:type="dxa"/>
+            <w:tcBorders>
+              <w:top w:val="single" w:sz="4" w:space="0" w:color="D0D7DE"/>
+              <w:left w:val="single" w:sz="4" w:space="0" w:color="D0D7DE"/>
+              <w:bottom w:val="single" w:sz="4" w:space="0" w:color="D0D7DE"/>
+              <w:right w:val="single" w:sz="4" w:space="0" w:color="D0D7DE"/>
+            </w:tcBorders>
+            <w:shd w:val="clear" w:color="auto" w:fill="FFFFFF"/>
+            <w:tcMar>
+              <w:top w:w="90" w:type="dxa"/>
+              <w:left w:w="130" w:type="dxa"/>
+              <w:bottom w:w="90" w:type="dxa"/>
+              <w:right w:w="130" w:type="dxa"/>
+            </w:tcMar>
+            <w:vAlign w:val="center"/>
+          </w:tcPr>
+          <w:p>
+            <w:pPr>
+              <w:keepNext/>
+              <w:spacing w:after="0"/>
+            </w:pPr>
+            <w:r>
+              <w:rPr>
+                <w:sz w:val="19"/>
+              </w:rPr>
+              <w:t>5374af4b…</w:t>
             </w:r>
           </w:p>
         </w:tc>
@@ -9813,7 +10289,7 @@
         </w:trPr>
         <w:tc>
           <w:tcPr>
-            <w:tcW w:w="2835" w:type="dxa"/>
+            <w:tcW w:w="454" w:type="dxa"/>
             <w:tcBorders>
               <w:top w:val="single" w:sz="4" w:space="0" w:color="D0D7DE"/>
               <w:left w:val="single" w:sz="4" w:space="0" w:color="D0D7DE"/>
@@ -9838,13 +10314,13 @@
                 <w:b/>
                 <w:sz w:val="19"/>
               </w:rPr>
-              <w:t>Acceso fuera de horario</w:t>
-            </w:r>
-          </w:p>
-        </w:tc>
-        <w:tc>
-          <w:tcPr>
-            <w:tcW w:w="3118" w:type="dxa"/>
+              <w:t>6</w:t>
+            </w:r>
+          </w:p>
+        </w:tc>
+        <w:tc>
+          <w:tcPr>
+            <w:tcW w:w="2948" w:type="dxa"/>
             <w:tcBorders>
               <w:top w:val="single" w:sz="4" w:space="0" w:color="D0D7DE"/>
               <w:left w:val="single" w:sz="4" w:space="0" w:color="D0D7DE"/>
@@ -9868,13 +10344,13 @@
               <w:rPr>
                 <w:sz w:val="19"/>
               </w:rPr>
-              <w:t>puertaAbierta = true</w:t>
-            </w:r>
-          </w:p>
-        </w:tc>
-        <w:tc>
-          <w:tcPr>
-            <w:tcW w:w="3288" w:type="dxa"/>
+              <w:t>Exceso de eventos de acceso</w:t>
+            </w:r>
+          </w:p>
+        </w:tc>
+        <w:tc>
+          <w:tcPr>
+            <w:tcW w:w="2551" w:type="dxa"/>
             <w:tcBorders>
               <w:top w:val="single" w:sz="4" w:space="0" w:color="D0D7DE"/>
               <w:left w:val="single" w:sz="4" w:space="0" w:color="D0D7DE"/>
@@ -9898,7 +10374,67 @@
               <w:rPr>
                 <w:sz w:val="19"/>
               </w:rPr>
+              <w:t>eventosAcceso &gt; 20</w:t>
+            </w:r>
+          </w:p>
+        </w:tc>
+        <w:tc>
+          <w:tcPr>
+            <w:tcW w:w="1134" w:type="dxa"/>
+            <w:tcBorders>
+              <w:top w:val="single" w:sz="4" w:space="0" w:color="D0D7DE"/>
+              <w:left w:val="single" w:sz="4" w:space="0" w:color="D0D7DE"/>
+              <w:bottom w:val="single" w:sz="4" w:space="0" w:color="D0D7DE"/>
+              <w:right w:val="single" w:sz="4" w:space="0" w:color="D0D7DE"/>
+            </w:tcBorders>
+            <w:shd w:val="clear" w:color="auto" w:fill="F4F7FB"/>
+            <w:tcMar>
+              <w:top w:w="90" w:type="dxa"/>
+              <w:left w:w="130" w:type="dxa"/>
+              <w:bottom w:w="90" w:type="dxa"/>
+              <w:right w:w="130" w:type="dxa"/>
+            </w:tcMar>
+            <w:vAlign w:val="center"/>
+          </w:tcPr>
+          <w:p>
+            <w:pPr>
+              <w:spacing w:after="0"/>
+            </w:pPr>
+            <w:r>
+              <w:rPr>
+                <w:sz w:val="19"/>
+              </w:rPr>
               <w:t>correo</w:t>
+            </w:r>
+          </w:p>
+        </w:tc>
+        <w:tc>
+          <w:tcPr>
+            <w:tcW w:w="2154" w:type="dxa"/>
+            <w:tcBorders>
+              <w:top w:val="single" w:sz="4" w:space="0" w:color="D0D7DE"/>
+              <w:left w:val="single" w:sz="4" w:space="0" w:color="D0D7DE"/>
+              <w:bottom w:val="single" w:sz="4" w:space="0" w:color="D0D7DE"/>
+              <w:right w:val="single" w:sz="4" w:space="0" w:color="D0D7DE"/>
+            </w:tcBorders>
+            <w:shd w:val="clear" w:color="auto" w:fill="F4F7FB"/>
+            <w:tcMar>
+              <w:top w:w="90" w:type="dxa"/>
+              <w:left w:w="130" w:type="dxa"/>
+              <w:bottom w:w="90" w:type="dxa"/>
+              <w:right w:w="130" w:type="dxa"/>
+            </w:tcMar>
+            <w:vAlign w:val="center"/>
+          </w:tcPr>
+          <w:p>
+            <w:pPr>
+              <w:spacing w:after="0"/>
+            </w:pPr>
+            <w:r>
+              <w:rPr>
+                <w:sz w:val="19"/>
+              </w:rPr>
+              <w:t>562cc3a3…</w:t>
             </w:r>
           </w:p>
         </w:tc>
@@ -9911,9 +10447,124 @@
     </w:p>
     <w:p>
       <w:pPr>
+        <w:pStyle w:val="Listaconvietas"/>
+        <w:spacing w:after="40"/>
+      </w:pPr>
+      <w:r>
+        <w:rPr>
+          <w:b/>
+        </w:rPr>
+        <w:t xml:space="preserve">Destinatario: </w:t>
+      </w:r>
+      <w:r>
+        <w:t>todas las acciones notifican a mvalera@o365.unab.edu.co (cuenta del operador).</w:t>
+      </w:r>
+    </w:p>
+    <w:p>
+      <w:pPr>
+        <w:pStyle w:val="Listaconvietas"/>
+        <w:spacing w:after="40"/>
+      </w:pPr>
+      <w:r>
+        <w:rPr>
+          <w:b/>
+        </w:rPr>
+        <w:t xml:space="preserve">Criterio de diseño: </w:t>
+      </w:r>
+      <w:r>
+        <w:t>las condiciones se definieron sobre telemetrías numéricas para que el umbral sea explicable y trazable al datasheet; los estados booleanos (fuga, puerta) se cubren con los indicadores numéricos asociados (humedad de piso, eventos de acceso).</w:t>
+      </w:r>
+    </w:p>
+    <w:p>
+      <w:pPr>
+        <w:pStyle w:val="Listaconvietas"/>
+        <w:spacing w:after="40"/>
+      </w:pPr>
+      <w:r>
+        <w:rPr>
+          <w:b/>
+        </w:rPr>
+        <w:t xml:space="preserve">Verificación: </w:t>
+      </w:r>
+      <w:r>
+        <w:t>la lista de reglas muestra las seis en estado Habilitado (evidencias/06-reglas-6-habilitadas.png).</w:t>
+      </w:r>
+    </w:p>
+    <w:p>
+      <w:pPr>
+        <w:keepNext/>
+        <w:spacing w:after="60"/>
+        <w:jc w:val="center"/>
+      </w:pPr>
+      <w:r>
+        <w:rPr>
+          <w:noProof/>
+        </w:rPr>
+        <w:lastRenderedPageBreak/>
+        <w:drawing>
+          <wp:inline distT="0" distB="0" distL="0" distR="0" wp14:anchorId="53CBB767" wp14:editId="4947C7A1">
+            <wp:extent cx="5940000" cy="3712500"/>
+            <wp:effectExtent l="0" t="0" r="0" b="0"/>
+            <wp:docPr id="2" name="Picture 2"/>
+            <wp:cNvGraphicFramePr>
+              <a:graphicFrameLocks xmlns:a="http://schemas.openxmlformats.org/drawingml/2006/main" noChangeAspect="1"/>
+            </wp:cNvGraphicFramePr>
+            <a:graphic xmlns:a="http://schemas.openxmlformats.org/drawingml/2006/main">
+              <a:graphicData uri="http://schemas.openxmlformats.org/drawingml/2006/picture">
+                <pic:pic xmlns:pic="http://schemas.openxmlformats.org/drawingml/2006/picture">
+                  <pic:nvPicPr>
+                    <pic:cNvPr id="0" name="06-reglas-6-habilitadas.png"/>
+                    <pic:cNvPicPr/>
+                  </pic:nvPicPr>
+                  <pic:blipFill>
+                    <a:blip r:embed="rId9"/>
+                    <a:stretch>
+                      <a:fillRect/>
+                    </a:stretch>
+                  </pic:blipFill>
+                  <pic:spPr>
+                    <a:xfrm>
+                      <a:off x="0" y="0"/>
+                      <a:ext cx="5940000" cy="3712500"/>
+                    </a:xfrm>
+                    <a:prstGeom prst="rect">
+                      <a:avLst/>
+                    </a:prstGeom>
+                  </pic:spPr>
+                </pic:pic>
+              </a:graphicData>
+            </a:graphic>
+          </wp:inline>
+        </w:drawing>
+      </w:r>
+    </w:p>
+    <w:p>
+      <w:pPr>
+        <w:spacing w:after="200"/>
+        <w:jc w:val="center"/>
+      </w:pPr>
+      <w:r>
+        <w:rPr>
+          <w:b/>
+          <w:color w:val="1F5FA8"/>
+          <w:sz w:val="18"/>
+        </w:rPr>
+        <w:t xml:space="preserve">Figura 2. </w:t>
+      </w:r>
+      <w:r>
+        <w:rPr>
+          <w:i/>
+          <w:color w:val="5B6570"/>
+          <w:sz w:val="18"/>
+        </w:rPr>
+        <w:t>Evidencia E6 — las seis reglas de la aplicación, habilitadas.</w:t>
+      </w:r>
+    </w:p>
+    <w:p>
+      <w:pPr>
         <w:pStyle w:val="Ttulo1"/>
       </w:pPr>
-      <w:bookmarkStart w:id="10" w:name="_Toc241156672"/>
+      <w:bookmarkStart w:id="10" w:name="_Toc241161859"/>
       <w:r>
         <w:t>10. Limitaciones percibidas de IoT Central</w:t>
       </w:r>
@@ -9998,7 +10649,7 @@
       <w:pPr>
         <w:pStyle w:val="Ttulo1"/>
       </w:pPr>
-      <w:bookmarkStart w:id="11" w:name="_Toc241156673"/>
+      <w:bookmarkStart w:id="11" w:name="_Toc241161860"/>
       <w:r>
         <w:t>11. Repositorio y manejo de secretos</w:t>
       </w:r>
@@ -10006,11 +10657,7 @@
     </w:p>
     <w:p>
       <w:r>
-        <w:t xml:space="preserve">El repositorio incluye el código de los diez orígenes, los dos proyectos Wokwi, las herramientas de despliegue y generación de documentos, y las evidencias. Las credenciales nunca viajan en el código: los scripts leen ID Scope </w:t>
-      </w:r>
-      <w:r>
-        <w:lastRenderedPageBreak/>
-        <w:t>y claves desde variables de entorno o desde .secrets/env/&lt;device&gt;.env, y los archivos .secrets/, secrets.h y *.pem están excluidos por .gitignore.</w:t>
+        <w:t>El repositorio incluye el código de los diez orígenes, los dos proyectos Wokwi, las herramientas de despliegue y generación de documentos, y las evidencias. Las credenciales nunca viajan en el código: los scripts leen ID Scope y claves desde variables de entorno o desde .secrets/env/&lt;device&gt;.env, y los archivos .secrets/, secrets.h y *.pem están excluidos por .gitignore.</w:t>
       </w:r>
     </w:p>
     <w:tbl>
@@ -10163,7 +10810,7 @@
       <w:pPr>
         <w:pStyle w:val="Ttulo1"/>
       </w:pPr>
-      <w:bookmarkStart w:id="12" w:name="_Toc241156674"/>
+      <w:bookmarkStart w:id="12" w:name="_Toc241161861"/>
       <w:r>
         <w:lastRenderedPageBreak/>
         <w:t>Anexo A — Datasheets y tablas de parámetros</w:t>
@@ -10483,13 +11130,7 @@
               <w:rPr>
                 <w:sz w:val="19"/>
               </w:rPr>
-              <w:t>−</w:t>
-            </w:r>
-            <w:r>
-              <w:rPr>
-                <w:sz w:val="19"/>
-              </w:rPr>
-              <w:t>40 … 80 °C</w:t>
+              <w:t>−40 … 80 °C</w:t>
             </w:r>
           </w:p>
         </w:tc>
@@ -10875,13 +11516,7 @@
               <w:rPr>
                 <w:sz w:val="19"/>
               </w:rPr>
-              <w:t>−</w:t>
-            </w:r>
-            <w:r>
-              <w:rPr>
-                <w:sz w:val="19"/>
-              </w:rPr>
-              <w:t>500 … 500 Pa</w:t>
+              <w:t>−500 … 500 Pa</w:t>
             </w:r>
           </w:p>
         </w:tc>
@@ -11074,13 +11709,7 @@
               <w:rPr>
                 <w:sz w:val="19"/>
               </w:rPr>
-              <w:t>−</w:t>
-            </w:r>
-            <w:r>
-              <w:rPr>
-                <w:sz w:val="19"/>
-              </w:rPr>
-              <w:t>40 … 65 °C / 0 … 1500 W/m²</w:t>
+              <w:t>−40 … 65 °C / 0 … 1500 W/m²</w:t>
             </w:r>
           </w:p>
         </w:tc>
@@ -12147,7 +12776,7 @@
       <w:pPr>
         <w:pStyle w:val="Ttulo1"/>
       </w:pPr>
-      <w:bookmarkStart w:id="13" w:name="_Toc241156675"/>
+      <w:bookmarkStart w:id="13" w:name="_Toc241161862"/>
       <w:r>
         <w:t>Anexo B — Evidencias y comparativa de los 4 días</w:t>
       </w:r>
@@ -12159,8 +12788,8 @@
       </w:r>
     </w:p>
     <w:sectPr>
-      <w:headerReference w:type="default" r:id="rId9"/>
-      <w:footerReference w:type="default" r:id="rId10"/>
+      <w:headerReference w:type="default" r:id="rId10"/>
+      <w:footerReference w:type="default" r:id="rId11"/>
       <w:pgSz w:w="11906" w:h="16838"/>
       <w:pgMar w:top="1134" w:right="1134" w:bottom="1020" w:left="1134" w:header="720" w:footer="720" w:gutter="0"/>
       <w:cols w:space="720"/>
@@ -12509,31 +13138,31 @@
       </w:rPr>
     </w:lvl>
   </w:abstractNum>
-  <w:num w:numId="1" w16cid:durableId="665548624">
+  <w:num w:numId="1" w16cid:durableId="228226785">
     <w:abstractNumId w:val="8"/>
   </w:num>
-  <w:num w:numId="2" w16cid:durableId="570040635">
+  <w:num w:numId="2" w16cid:durableId="1411728687">
     <w:abstractNumId w:val="6"/>
   </w:num>
-  <w:num w:numId="3" w16cid:durableId="291519789">
+  <w:num w:numId="3" w16cid:durableId="582567886">
     <w:abstractNumId w:val="5"/>
   </w:num>
-  <w:num w:numId="4" w16cid:durableId="1553686584">
+  <w:num w:numId="4" w16cid:durableId="1253202423">
     <w:abstractNumId w:val="4"/>
   </w:num>
-  <w:num w:numId="5" w16cid:durableId="999426867">
+  <w:num w:numId="5" w16cid:durableId="1600681205">
     <w:abstractNumId w:val="7"/>
   </w:num>
-  <w:num w:numId="6" w16cid:durableId="2119444397">
+  <w:num w:numId="6" w16cid:durableId="274557104">
     <w:abstractNumId w:val="3"/>
   </w:num>
-  <w:num w:numId="7" w16cid:durableId="570579407">
+  <w:num w:numId="7" w16cid:durableId="138347294">
     <w:abstractNumId w:val="2"/>
   </w:num>
-  <w:num w:numId="8" w16cid:durableId="185022068">
+  <w:num w:numId="8" w16cid:durableId="1671836056">
     <w:abstractNumId w:val="1"/>
   </w:num>
-  <w:num w:numId="9" w16cid:durableId="1722823821">
+  <w:num w:numId="9" w16cid:durableId="987824964">
     <w:abstractNumId w:val="0"/>
   </w:num>
 </w:numbering>
@@ -23926,7 +24555,7 @@
     <w:autoRedefine/>
     <w:uiPriority w:val="39"/>
     <w:unhideWhenUsed/>
-    <w:rsid w:val="00CC4222"/>
+    <w:rsid w:val="00D654E1"/>
     <w:pPr>
       <w:spacing w:after="100"/>
     </w:pPr>
@@ -23936,7 +24565,7 @@
     <w:basedOn w:val="Fuentedeprrafopredeter"/>
     <w:uiPriority w:val="99"/>
     <w:unhideWhenUsed/>
-    <w:rsid w:val="00CC4222"/>
+    <w:rsid w:val="00D654E1"/>
     <w:rPr>
       <w:color w:val="0000FF" w:themeColor="hyperlink"/>
       <w:u w:val="single"/>

</xml_diff>